<commit_message>
chore: sincronizar trabajo ISCAM/EUDR de la ultima semana (10-20 oct)
Consolida en un commit el trabajo pendiente de 5 dias: ajustes del indice
ISCAM/PVE (D10, IP5, sindato, ratificacion, idioma), scorecards por
cooperativa, instrumentos de encuesta actualizados, nuevas bases de datos
(174 cooperativas, consultas RUC/SUNAT, DUAs), bibliografia EUDR descargada,
y los scripts de construccion/correccion usados para generarlos.

Se excluyen intencionalmente 9 scripts (test_neon_conn.py, batch_neon_d3*.py,
batch_d3_*.py, d3_query_all.py, oefa_*.py) por contener una contrasena de
Neon Postgres hardcodeada en texto plano - pendiente de limpiar/rotar antes
de versionarlos.

Co-Authored-By: Claude Sonnet 5 <noreply@anthropic.com>
</commit_message>
<xml_diff>
--- a/DT-ISCAM-001_Indice_ISCAM_Trabajo.docx
+++ b/DT-ISCAM-001_Indice_ISCAM_Trabajo.docx
@@ -94,7 +94,7 @@
           <w:color w:val="000000"/>
           <w:sz w:val="26"/>
         </w:rPr>
-        <w:t>El impacto del Pacto Verde Europeo en la performance</w:t>
+        <w:t>El impacto del Pacto Verde Europeo en el desempeño</w:t>
       </w:r>
     </w:p>
     <w:p>
@@ -233,7 +233,7 @@
           <w:color w:val="000000"/>
           <w:sz w:val="22"/>
         </w:rPr>
-        <w:t>"¿En qué medida el alineamiento con los pilares del Pacto Verde Europeo mejora o compromete la performance comercial de las cooperativas de café y cacao del Perú?"</w:t>
+        <w:t>"¿En qué medida el alineamiento con los pilares del Pacto Verde Europeo mejora o compromete el desempeño comercial de las cooperativas de café y cacao del Perú?"</w:t>
       </w:r>
     </w:p>
     <w:p>
@@ -2018,7 +2018,7 @@
           <w:color w:val="000000"/>
           <w:sz w:val="24"/>
         </w:rPr>
-        <w:t>El ISA-Completo es el score que condensa en un solo número (escala 0–100) la posición de cada organización frente al ecosistema regulatorio europeo. Su diseño responde a una pregunta económica: ¿cuál es el riesgo de mercado más urgente y cuál es el de mediano plazo?</w:t>
+        <w:t>El ISA-Completo es el puntaje que condensa en un solo número (escala 0–100) la posición de cada organización frente al ecosistema regulatorio europeo. Su diseño responde a una pregunta económica: ¿cuál es el riesgo de mercado más urgente y cuál es el de mediano plazo?</w:t>
       </w:r>
     </w:p>
     <w:p>
@@ -4165,7 +4165,7 @@
           <w:color w:val="000000"/>
           <w:sz w:val="22"/>
         </w:rPr>
-        <w:t>Las banderas duras — inh. vigente OSCE, trabajo forzoso confirmado, mezcla deliberada de lotes de origen no verificado — se reportan en la columna AD de ISCAM_Score y tienen precedencia sobre cualquier score. Son señales de exclusión directa del mercado.</w:t>
+        <w:t>Las banderas duras — inh. vigente OSCE, trabajo forzoso confirmado, mezcla deliberada de lotes de origen no verificado — se reportan en la columna AD de ISCAM_Score y tienen precedencia sobre cualquier puntaje. Son señales de exclusión directa del mercado.</w:t>
       </w:r>
     </w:p>
     <w:p>
@@ -4303,7 +4303,7 @@
                 <w:color w:val="FFFFFF"/>
                 <w:sz w:val="19"/>
               </w:rPr>
-              <w:t>Score principal</w:t>
+              <w:t>Puntaje principal</w:t>
             </w:r>
           </w:p>
         </w:tc>
@@ -4445,7 +4445,7 @@
                 <w:color w:val="000000"/>
                 <w:sz w:val="18"/>
               </w:rPr>
-              <w:t>Dashboard IP/ISA — semáforo, tipología 2×2, ranking</w:t>
+              <w:t>Panel IP/ISA — semáforo, tipología 2×2, ordenamiento</w:t>
             </w:r>
           </w:p>
         </w:tc>
@@ -4727,7 +4727,7 @@
                 <w:color w:val="000000"/>
                 <w:sz w:val="18"/>
               </w:rPr>
-              <w:t>D3 referenciando MATRIZ_174!U (scores Neon/OSCE)</w:t>
+              <w:t>D3 referenciando MATRIZ_174!U (puntajes Neon/OSCE)</w:t>
             </w:r>
           </w:p>
         </w:tc>
@@ -5038,7 +5038,7 @@
                 <w:color w:val="000000"/>
                 <w:sz w:val="18"/>
               </w:rPr>
-              <w:t>ISA-EUDR: cumplimiento EUDR — 70% del score total</w:t>
+              <w:t>ISA-EUDR: cumplimiento EUDR — 70% del puntaje total</w:t>
             </w:r>
           </w:p>
         </w:tc>
@@ -5109,7 +5109,7 @@
                 <w:color w:val="000000"/>
                 <w:sz w:val="18"/>
               </w:rPr>
-              <w:t>ISA-Completo: score unificado 0–100 — ISA-EUDR 70% + ISA-PV 30%</w:t>
+              <w:t>ISA-Completo: puntaje unificado 0–100 — ISA-EUDR 70% + ISA-PV 30%</w:t>
             </w:r>
           </w:p>
         </w:tc>
@@ -5180,7 +5180,7 @@
                 <w:color w:val="000000"/>
                 <w:sz w:val="18"/>
               </w:rPr>
-              <w:t>Referencia viva al ISA-Completo en el dashboard</w:t>
+              <w:t>Referencia viva al ISA-Completo en el panel</w:t>
             </w:r>
           </w:p>
         </w:tc>
@@ -5251,7 +5251,7 @@
                 <w:color w:val="000000"/>
                 <w:sz w:val="18"/>
               </w:rPr>
-              <w:t>ISA-PactoVerde: módulos ambientales y de desempeño — 30% del score total</w:t>
+              <w:t>ISA-PactoVerde: módulos ambientales y de desempeño — 30% del puntaje total</w:t>
             </w:r>
           </w:p>
         </w:tc>
@@ -5302,7 +5302,7 @@
           <w:color w:val="000000"/>
           <w:sz w:val="24"/>
         </w:rPr>
-        <w:t>D2, D5, D6: datos de trazabilidad referencing SCORECARDS.</w:t>
+        <w:t>D2, D5, D6: datos de trazabilidad referenciados desde SCORECARDS.</w:t>
       </w:r>
     </w:p>
     <w:p>
@@ -5317,7 +5317,7 @@
           <w:color w:val="000000"/>
           <w:sz w:val="24"/>
         </w:rPr>
-        <w:t>D3: scores Neon/OSCE poblad en MATRIZ_174!U (36 organizaciones con inh. vigente).</w:t>
+        <w:t>D3: puntajes Neon/OSCE poblados en MATRIZ_174!U (36 organizaciones con inh. vigente).</w:t>
       </w:r>
     </w:p>
     <w:p>
@@ -5501,7 +5501,7 @@
           <w:color w:val="000000"/>
           <w:sz w:val="24"/>
         </w:rPr>
-        <w:t>El índice ISCAM es una herramienta de trabajo construida sobre datos disponibles a octubre de 2026. Las siguientes limitaciones condicionan su uso y deben comunicarse a cualquier actor que tome decisiones basadas en los scores.</w:t>
+        <w:t>El índice ISCAM es una herramienta de trabajo construida sobre datos disponibles a octubre de 2026. Las siguientes limitaciones condicionan su uso y deben comunicarse a cualquier actor que tome decisiones basadas en los puntajes.</w:t>
       </w:r>
     </w:p>
     <w:p>
@@ -5573,7 +5573,7 @@
           <w:color w:val="000000"/>
           <w:sz w:val="24"/>
         </w:rPr>
-        <w:t>Si alguna dimensión D1–D7 falta, la geométrica produce 0 y el score se distorsiona. La lógica de re-ponderación por datos faltantes (excluir dimensión + redistribuir peso proporcionalmente) aún no está implementada en la fórmula Excel.</w:t>
+        <w:t>Si alguna dimensión D1–D7 falta, la geométrica produce 0 y el puntaje se distorsiona. La lógica de re-ponderación por datos faltantes (excluir dimensión + redistribuir peso proporcionalmente) aún no está implementada en la fórmula Excel.</w:t>
       </w:r>
     </w:p>
     <w:p>
@@ -5788,7 +5788,7 @@
           <w:color w:val="000000"/>
           <w:sz w:val="24"/>
         </w:rPr>
-        <w:t>Calibrar D3 con consulta directa a OSCE para organizaciones sin score en Neon.</w:t>
+        <w:t>Calibrar D3 con consulta directa a OSCE para organizaciones sin puntaje en Neon.</w:t>
       </w:r>
     </w:p>
     <w:p>
@@ -5912,7 +5912,7 @@
           <w:color w:val="000000"/>
           <w:sz w:val="24"/>
         </w:rPr>
-        <w:t>Fase 3 — Mediano plazo (3–6 meses): convertir scores en acciones</w:t>
+        <w:t>Fase 3 — Mediano plazo (3–6 meses): convertir puntajes en acciones</w:t>
       </w:r>
     </w:p>
     <w:p>
@@ -7586,7 +7586,7 @@
           <w:color w:val="000000"/>
           <w:sz w:val="20"/>
         </w:rPr>
-        <w:t>ISA-EUDR e ISA-PV usan pesos FIJOS (87,5%/12,5% y 70%/30%). IP e IV usan pesos IGUALES (20% por sub-dimensión). Los scores se recalculan automáticamente al modificar cualquier valor en la hoja ISCAM_Score de la plantilla.</w:t>
+        <w:t>ISA-EUDR e ISA-PV usan pesos FIJOS (87,5%/12,5% y 70%/30%). IP e IV usan pesos IGUALES (20% por sub-dimensión). Los puntajes se recalculan automáticamente al modificar cualquier valor en la hoja ISCAM_Score de la plantilla.</w:t>
       </w:r>
     </w:p>
     <w:p>

</xml_diff>